<commit_message>
Update Project Planning Template.docx
</commit_message>
<xml_diff>
--- a/docs/2 Project Planning Phase/Project Planning Template.docx
+++ b/docs/2 Project Planning Phase/Project Planning Template.docx
@@ -647,7 +647,7 @@
                 <w:sz w:val="20"/>
                 <w:szCs w:val="20"/>
               </w:rPr>
-              <w:t xml:space="preserve">USN-1</w:t>
+              <w:t>USN-1</w:t>
             </w:r>
           </w:p>
         </w:tc>
@@ -734,7 +734,7 @@
                 <w:sz w:val="20"/>
                 <w:szCs w:val="20"/>
               </w:rPr>
-              <w:t xml:space="preserve">High</w:t>
+              <w:t>High</w:t>
             </w:r>
           </w:p>
         </w:tc>
@@ -855,7 +855,7 @@
                 <w:sz w:val="20"/>
                 <w:szCs w:val="20"/>
               </w:rPr>
-              <w:t xml:space="preserve">USN-2</w:t>
+              <w:t>USN-2</w:t>
             </w:r>
           </w:p>
         </w:tc>
@@ -942,7 +942,7 @@
                 <w:sz w:val="20"/>
                 <w:szCs w:val="20"/>
               </w:rPr>
-              <w:t xml:space="preserve">High</w:t>
+              <w:t>High</w:t>
             </w:r>
           </w:p>
         </w:tc>
@@ -1063,7 +1063,7 @@
                 <w:sz w:val="20"/>
                 <w:szCs w:val="20"/>
               </w:rPr>
-              <w:t xml:space="preserve">USN-3</w:t>
+              <w:t>USN-3</w:t>
             </w:r>
           </w:p>
         </w:tc>
@@ -1150,7 +1150,7 @@
                 <w:sz w:val="20"/>
                 <w:szCs w:val="20"/>
               </w:rPr>
-              <w:t xml:space="preserve">High</w:t>
+              <w:t>High</w:t>
             </w:r>
           </w:p>
         </w:tc>
@@ -1271,7 +1271,7 @@
                 <w:sz w:val="20"/>
                 <w:szCs w:val="20"/>
               </w:rPr>
-              <w:t xml:space="preserve">USN-4</w:t>
+              <w:t>USN-4</w:t>
             </w:r>
           </w:p>
         </w:tc>
@@ -1358,7 +1358,7 @@
                 <w:sz w:val="20"/>
                 <w:szCs w:val="20"/>
               </w:rPr>
-              <w:t xml:space="preserve">High</w:t>
+              <w:t>High</w:t>
             </w:r>
           </w:p>
         </w:tc>
@@ -1479,7 +1479,7 @@
                 <w:sz w:val="20"/>
                 <w:szCs w:val="20"/>
               </w:rPr>
-              <w:t xml:space="preserve">USN-5</w:t>
+              <w:t>USN-5</w:t>
             </w:r>
           </w:p>
         </w:tc>
@@ -1566,7 +1566,7 @@
                 <w:sz w:val="20"/>
                 <w:szCs w:val="20"/>
               </w:rPr>
-              <w:t xml:space="preserve">High</w:t>
+              <w:t>High</w:t>
             </w:r>
           </w:p>
         </w:tc>
@@ -1687,7 +1687,7 @@
                 <w:sz w:val="20"/>
                 <w:szCs w:val="20"/>
               </w:rPr>
-              <w:t xml:space="preserve">USN-6</w:t>
+              <w:t>USN-6</w:t>
             </w:r>
           </w:p>
         </w:tc>
@@ -1774,7 +1774,7 @@
                 <w:sz w:val="20"/>
                 <w:szCs w:val="20"/>
               </w:rPr>
-              <w:t xml:space="preserve">High</w:t>
+              <w:t>High</w:t>
             </w:r>
           </w:p>
         </w:tc>
@@ -1895,7 +1895,7 @@
                 <w:sz w:val="20"/>
                 <w:szCs w:val="20"/>
               </w:rPr>
-              <w:t xml:space="preserve">USN-7</w:t>
+              <w:t>USN-7</w:t>
             </w:r>
           </w:p>
         </w:tc>
@@ -1982,7 +1982,7 @@
                 <w:sz w:val="20"/>
                 <w:szCs w:val="20"/>
               </w:rPr>
-              <w:t xml:space="preserve">High</w:t>
+              <w:t>High</w:t>
             </w:r>
           </w:p>
         </w:tc>
@@ -2103,7 +2103,7 @@
                 <w:sz w:val="20"/>
                 <w:szCs w:val="20"/>
               </w:rPr>
-              <w:t xml:space="preserve">USN-8</w:t>
+              <w:t>USN-8</w:t>
             </w:r>
           </w:p>
         </w:tc>
@@ -2190,7 +2190,7 @@
                 <w:sz w:val="20"/>
                 <w:szCs w:val="20"/>
               </w:rPr>
-              <w:t xml:space="preserve">High</w:t>
+              <w:t>High</w:t>
             </w:r>
           </w:p>
         </w:tc>
@@ -2311,7 +2311,7 @@
                 <w:sz w:val="20"/>
                 <w:szCs w:val="20"/>
               </w:rPr>
-              <w:t xml:space="preserve">USN-9</w:t>
+              <w:t>USN-9</w:t>
             </w:r>
           </w:p>
         </w:tc>
@@ -2398,7 +2398,7 @@
                 <w:sz w:val="20"/>
                 <w:szCs w:val="20"/>
               </w:rPr>
-              <w:t xml:space="preserve">Medium</w:t>
+              <w:t>Medium</w:t>
             </w:r>
           </w:p>
         </w:tc>
@@ -2519,7 +2519,7 @@
                 <w:sz w:val="20"/>
                 <w:szCs w:val="20"/>
               </w:rPr>
-              <w:t xml:space="preserve">USN-10</w:t>
+              <w:t>USN-10</w:t>
             </w:r>
           </w:p>
         </w:tc>
@@ -2606,7 +2606,7 @@
                 <w:sz w:val="20"/>
                 <w:szCs w:val="20"/>
               </w:rPr>
-              <w:t xml:space="preserve">Medium</w:t>
+              <w:t>Medium</w:t>
             </w:r>
           </w:p>
         </w:tc>
@@ -2727,7 +2727,7 @@
                 <w:sz w:val="20"/>
                 <w:szCs w:val="20"/>
               </w:rPr>
-              <w:t xml:space="preserve">USN-11</w:t>
+              <w:t>USN-11</w:t>
             </w:r>
           </w:p>
         </w:tc>
@@ -2814,7 +2814,7 @@
                 <w:sz w:val="20"/>
                 <w:szCs w:val="20"/>
               </w:rPr>
-              <w:t xml:space="preserve">High</w:t>
+              <w:t>High</w:t>
             </w:r>
           </w:p>
         </w:tc>
@@ -2935,7 +2935,7 @@
                 <w:sz w:val="20"/>
                 <w:szCs w:val="20"/>
               </w:rPr>
-              <w:t xml:space="preserve">USN-12</w:t>
+              <w:t>USN-12</w:t>
             </w:r>
           </w:p>
         </w:tc>
@@ -3022,7 +3022,7 @@
                 <w:sz w:val="20"/>
                 <w:szCs w:val="20"/>
               </w:rPr>
-              <w:t xml:space="preserve">High</w:t>
+              <w:t>High</w:t>
             </w:r>
           </w:p>
         </w:tc>
@@ -3416,13 +3416,42 @@
                 <w:sz w:val="20"/>
                 <w:szCs w:val="20"/>
               </w:rPr>
+              <w:t>6 Days</w:t>
+            </w:r>
+          </w:p>
+        </w:tc>
+        <w:tc>
+          <w:tcPr>
+            <w:tcW w:type="dxa" w:w="1400"/>
+            <w:tcBorders>
+              <w:top w:val="single" w:color="999999" w:sz="4"/>
+              <w:left w:val="single" w:color="999999" w:sz="4"/>
+              <w:bottom w:val="single" w:color="999999" w:sz="4"/>
+              <w:right w:val="single" w:color="999999" w:sz="4"/>
+            </w:tcBorders>
+            <w:tcMar>
+              <w:top w:type="dxa" w:w="60"/>
+              <w:left w:type="dxa" w:w="100"/>
+              <w:bottom w:type="dxa" w:w="60"/>
+              <w:right w:type="dxa" w:w="100"/>
+            </w:tcMar>
+          </w:tcPr>
+          <w:p>
+            <w:r>
+              <w:rPr>
+                <w:rFonts w:ascii="Calibri" w:cs="Calibri" w:eastAsia="Calibri" w:hAnsi="Calibri"/>
+                <w:b w:val="false"/>
+                <w:bCs w:val="false"/>
+                <w:sz w:val="20"/>
+                <w:szCs w:val="20"/>
+              </w:rPr>
               <w:t xml:space="preserve"/>
             </w:r>
           </w:p>
         </w:tc>
         <w:tc>
           <w:tcPr>
-            <w:tcW w:type="dxa" w:w="1400"/>
+            <w:tcW w:type="dxa" w:w="1500"/>
             <w:tcBorders>
               <w:top w:val="single" w:color="999999" w:sz="4"/>
               <w:left w:val="single" w:color="999999" w:sz="4"/>
@@ -3451,35 +3480,6 @@
         </w:tc>
         <w:tc>
           <w:tcPr>
-            <w:tcW w:type="dxa" w:w="1500"/>
-            <w:tcBorders>
-              <w:top w:val="single" w:color="999999" w:sz="4"/>
-              <w:left w:val="single" w:color="999999" w:sz="4"/>
-              <w:bottom w:val="single" w:color="999999" w:sz="4"/>
-              <w:right w:val="single" w:color="999999" w:sz="4"/>
-            </w:tcBorders>
-            <w:tcMar>
-              <w:top w:type="dxa" w:w="60"/>
-              <w:left w:type="dxa" w:w="100"/>
-              <w:bottom w:type="dxa" w:w="60"/>
-              <w:right w:type="dxa" w:w="100"/>
-            </w:tcMar>
-          </w:tcPr>
-          <w:p>
-            <w:r>
-              <w:rPr>
-                <w:rFonts w:ascii="Calibri" w:cs="Calibri" w:eastAsia="Calibri" w:hAnsi="Calibri"/>
-                <w:b w:val="false"/>
-                <w:bCs w:val="false"/>
-                <w:sz w:val="20"/>
-                <w:szCs w:val="20"/>
-              </w:rPr>
-              <w:t xml:space="preserve"/>
-            </w:r>
-          </w:p>
-        </w:tc>
-        <w:tc>
-          <w:tcPr>
             <w:tcW w:type="dxa" w:w="1526"/>
             <w:tcBorders>
               <w:top w:val="single" w:color="999999" w:sz="4"/>
@@ -3503,7 +3503,7 @@
                 <w:sz w:val="20"/>
                 <w:szCs w:val="20"/>
               </w:rPr>
-              <w:t xml:space="preserve"/>
+              <w:t>9</w:t>
             </w:r>
           </w:p>
         </w:tc>
@@ -3624,13 +3624,42 @@
                 <w:sz w:val="20"/>
                 <w:szCs w:val="20"/>
               </w:rPr>
+              <w:t>6 Days</w:t>
+            </w:r>
+          </w:p>
+        </w:tc>
+        <w:tc>
+          <w:tcPr>
+            <w:tcW w:type="dxa" w:w="1400"/>
+            <w:tcBorders>
+              <w:top w:val="single" w:color="999999" w:sz="4"/>
+              <w:left w:val="single" w:color="999999" w:sz="4"/>
+              <w:bottom w:val="single" w:color="999999" w:sz="4"/>
+              <w:right w:val="single" w:color="999999" w:sz="4"/>
+            </w:tcBorders>
+            <w:tcMar>
+              <w:top w:type="dxa" w:w="60"/>
+              <w:left w:type="dxa" w:w="100"/>
+              <w:bottom w:type="dxa" w:w="60"/>
+              <w:right w:type="dxa" w:w="100"/>
+            </w:tcMar>
+          </w:tcPr>
+          <w:p>
+            <w:r>
+              <w:rPr>
+                <w:rFonts w:ascii="Calibri" w:cs="Calibri" w:eastAsia="Calibri" w:hAnsi="Calibri"/>
+                <w:b w:val="false"/>
+                <w:bCs w:val="false"/>
+                <w:sz w:val="20"/>
+                <w:szCs w:val="20"/>
+              </w:rPr>
               <w:t xml:space="preserve"/>
             </w:r>
           </w:p>
         </w:tc>
         <w:tc>
           <w:tcPr>
-            <w:tcW w:type="dxa" w:w="1400"/>
+            <w:tcW w:type="dxa" w:w="1500"/>
             <w:tcBorders>
               <w:top w:val="single" w:color="999999" w:sz="4"/>
               <w:left w:val="single" w:color="999999" w:sz="4"/>
@@ -3659,35 +3688,6 @@
         </w:tc>
         <w:tc>
           <w:tcPr>
-            <w:tcW w:type="dxa" w:w="1500"/>
-            <w:tcBorders>
-              <w:top w:val="single" w:color="999999" w:sz="4"/>
-              <w:left w:val="single" w:color="999999" w:sz="4"/>
-              <w:bottom w:val="single" w:color="999999" w:sz="4"/>
-              <w:right w:val="single" w:color="999999" w:sz="4"/>
-            </w:tcBorders>
-            <w:tcMar>
-              <w:top w:type="dxa" w:w="60"/>
-              <w:left w:type="dxa" w:w="100"/>
-              <w:bottom w:type="dxa" w:w="60"/>
-              <w:right w:type="dxa" w:w="100"/>
-            </w:tcMar>
-          </w:tcPr>
-          <w:p>
-            <w:r>
-              <w:rPr>
-                <w:rFonts w:ascii="Calibri" w:cs="Calibri" w:eastAsia="Calibri" w:hAnsi="Calibri"/>
-                <w:b w:val="false"/>
-                <w:bCs w:val="false"/>
-                <w:sz w:val="20"/>
-                <w:szCs w:val="20"/>
-              </w:rPr>
-              <w:t xml:space="preserve"/>
-            </w:r>
-          </w:p>
-        </w:tc>
-        <w:tc>
-          <w:tcPr>
             <w:tcW w:type="dxa" w:w="1526"/>
             <w:tcBorders>
               <w:top w:val="single" w:color="999999" w:sz="4"/>
@@ -3711,7 +3711,7 @@
                 <w:sz w:val="20"/>
                 <w:szCs w:val="20"/>
               </w:rPr>
-              <w:t xml:space="preserve"/>
+              <w:t>11</w:t>
             </w:r>
           </w:p>
         </w:tc>
@@ -3832,13 +3832,42 @@
                 <w:sz w:val="20"/>
                 <w:szCs w:val="20"/>
               </w:rPr>
+              <w:t>6 Days</w:t>
+            </w:r>
+          </w:p>
+        </w:tc>
+        <w:tc>
+          <w:tcPr>
+            <w:tcW w:type="dxa" w:w="1400"/>
+            <w:tcBorders>
+              <w:top w:val="single" w:color="999999" w:sz="4"/>
+              <w:left w:val="single" w:color="999999" w:sz="4"/>
+              <w:bottom w:val="single" w:color="999999" w:sz="4"/>
+              <w:right w:val="single" w:color="999999" w:sz="4"/>
+            </w:tcBorders>
+            <w:tcMar>
+              <w:top w:type="dxa" w:w="60"/>
+              <w:left w:type="dxa" w:w="100"/>
+              <w:bottom w:type="dxa" w:w="60"/>
+              <w:right w:type="dxa" w:w="100"/>
+            </w:tcMar>
+          </w:tcPr>
+          <w:p>
+            <w:r>
+              <w:rPr>
+                <w:rFonts w:ascii="Calibri" w:cs="Calibri" w:eastAsia="Calibri" w:hAnsi="Calibri"/>
+                <w:b w:val="false"/>
+                <w:bCs w:val="false"/>
+                <w:sz w:val="20"/>
+                <w:szCs w:val="20"/>
+              </w:rPr>
               <w:t xml:space="preserve"/>
             </w:r>
           </w:p>
         </w:tc>
         <w:tc>
           <w:tcPr>
-            <w:tcW w:type="dxa" w:w="1400"/>
+            <w:tcW w:type="dxa" w:w="1500"/>
             <w:tcBorders>
               <w:top w:val="single" w:color="999999" w:sz="4"/>
               <w:left w:val="single" w:color="999999" w:sz="4"/>
@@ -3867,35 +3896,6 @@
         </w:tc>
         <w:tc>
           <w:tcPr>
-            <w:tcW w:type="dxa" w:w="1500"/>
-            <w:tcBorders>
-              <w:top w:val="single" w:color="999999" w:sz="4"/>
-              <w:left w:val="single" w:color="999999" w:sz="4"/>
-              <w:bottom w:val="single" w:color="999999" w:sz="4"/>
-              <w:right w:val="single" w:color="999999" w:sz="4"/>
-            </w:tcBorders>
-            <w:tcMar>
-              <w:top w:type="dxa" w:w="60"/>
-              <w:left w:type="dxa" w:w="100"/>
-              <w:bottom w:type="dxa" w:w="60"/>
-              <w:right w:type="dxa" w:w="100"/>
-            </w:tcMar>
-          </w:tcPr>
-          <w:p>
-            <w:r>
-              <w:rPr>
-                <w:rFonts w:ascii="Calibri" w:cs="Calibri" w:eastAsia="Calibri" w:hAnsi="Calibri"/>
-                <w:b w:val="false"/>
-                <w:bCs w:val="false"/>
-                <w:sz w:val="20"/>
-                <w:szCs w:val="20"/>
-              </w:rPr>
-              <w:t xml:space="preserve"/>
-            </w:r>
-          </w:p>
-        </w:tc>
-        <w:tc>
-          <w:tcPr>
             <w:tcW w:type="dxa" w:w="1526"/>
             <w:tcBorders>
               <w:top w:val="single" w:color="999999" w:sz="4"/>
@@ -3919,7 +3919,7 @@
                 <w:sz w:val="20"/>
                 <w:szCs w:val="20"/>
               </w:rPr>
-              <w:t xml:space="preserve"/>
+              <w:t>10</w:t>
             </w:r>
           </w:p>
         </w:tc>
@@ -4040,13 +4040,42 @@
                 <w:sz w:val="20"/>
                 <w:szCs w:val="20"/>
               </w:rPr>
+              <w:t>6 Days</w:t>
+            </w:r>
+          </w:p>
+        </w:tc>
+        <w:tc>
+          <w:tcPr>
+            <w:tcW w:type="dxa" w:w="1400"/>
+            <w:tcBorders>
+              <w:top w:val="single" w:color="999999" w:sz="4"/>
+              <w:left w:val="single" w:color="999999" w:sz="4"/>
+              <w:bottom w:val="single" w:color="999999" w:sz="4"/>
+              <w:right w:val="single" w:color="999999" w:sz="4"/>
+            </w:tcBorders>
+            <w:tcMar>
+              <w:top w:type="dxa" w:w="60"/>
+              <w:left w:type="dxa" w:w="100"/>
+              <w:bottom w:type="dxa" w:w="60"/>
+              <w:right w:type="dxa" w:w="100"/>
+            </w:tcMar>
+          </w:tcPr>
+          <w:p>
+            <w:r>
+              <w:rPr>
+                <w:rFonts w:ascii="Calibri" w:cs="Calibri" w:eastAsia="Calibri" w:hAnsi="Calibri"/>
+                <w:b w:val="false"/>
+                <w:bCs w:val="false"/>
+                <w:sz w:val="20"/>
+                <w:szCs w:val="20"/>
+              </w:rPr>
               <w:t xml:space="preserve"/>
             </w:r>
           </w:p>
         </w:tc>
         <w:tc>
           <w:tcPr>
-            <w:tcW w:type="dxa" w:w="1400"/>
+            <w:tcW w:type="dxa" w:w="1500"/>
             <w:tcBorders>
               <w:top w:val="single" w:color="999999" w:sz="4"/>
               <w:left w:val="single" w:color="999999" w:sz="4"/>
@@ -4075,35 +4104,6 @@
         </w:tc>
         <w:tc>
           <w:tcPr>
-            <w:tcW w:type="dxa" w:w="1500"/>
-            <w:tcBorders>
-              <w:top w:val="single" w:color="999999" w:sz="4"/>
-              <w:left w:val="single" w:color="999999" w:sz="4"/>
-              <w:bottom w:val="single" w:color="999999" w:sz="4"/>
-              <w:right w:val="single" w:color="999999" w:sz="4"/>
-            </w:tcBorders>
-            <w:tcMar>
-              <w:top w:type="dxa" w:w="60"/>
-              <w:left w:type="dxa" w:w="100"/>
-              <w:bottom w:type="dxa" w:w="60"/>
-              <w:right w:type="dxa" w:w="100"/>
-            </w:tcMar>
-          </w:tcPr>
-          <w:p>
-            <w:r>
-              <w:rPr>
-                <w:rFonts w:ascii="Calibri" w:cs="Calibri" w:eastAsia="Calibri" w:hAnsi="Calibri"/>
-                <w:b w:val="false"/>
-                <w:bCs w:val="false"/>
-                <w:sz w:val="20"/>
-                <w:szCs w:val="20"/>
-              </w:rPr>
-              <w:t xml:space="preserve"/>
-            </w:r>
-          </w:p>
-        </w:tc>
-        <w:tc>
-          <w:tcPr>
             <w:tcW w:type="dxa" w:w="1526"/>
             <w:tcBorders>
               <w:top w:val="single" w:color="999999" w:sz="4"/>
@@ -4127,7 +4127,7 @@
                 <w:sz w:val="20"/>
                 <w:szCs w:val="20"/>
               </w:rPr>
-              <w:t xml:space="preserve"/>
+              <w:t>11</w:t>
             </w:r>
           </w:p>
         </w:tc>

</xml_diff>